<commit_message>
Acrescenta as provas sensoriais (peso na mão, 'ela congela 3 segundos') à linha do tempo do MUS
Co-Authored-By: Claude Fable 5.1 <noreply@anthropic.com>
Claude-Session: https://claude.ai/code/session_017HYp1xhSzB6Ui5hyJvLbGE
</commit_message>
<xml_diff>
--- a/analise-ed/10_Pontos_Logicos_VSL_SodaFil.docx
+++ b/analise-ed/10_Pontos_Logicos_VSL_SodaFil.docx
@@ -3701,7 +3701,22 @@
         <w:t xml:space="preserve"> </w:t>
       </w:r>
       <w:r>
-        <w:t xml:space="preserve">Afirmação: 72 h ereção matinal espontânea; 5 dias 91% notam o pau mais cheio na primeira mijada; 14 dias sem pílula; 21 dias crescimento mensurável; 30 dias reversão na ressonância. Prova: o selo postal volta como marco (15A: dia 1 inteiro, dia 3 rasgado); fita métrica aos 21 dias; RM do Mike aos 30 (60% → 28%). Imagem: os dois anéis de selo na mesa. Loop:</w:t>
+        <w:t xml:space="preserve">Afirmação: 72 h ereção matinal espontânea; 5 dias 91% notam o pau mais cheio e o peso na mão na primeira mijada; 14 dias sem pílula; 21 dias crescimento mensurável (fita métrica,</w:t>
+      </w:r>
+      <w:r>
+        <w:t xml:space="preserve"> </w:t>
+      </w:r>
+      <w:r>
+        <w:t xml:space="preserve">“</w:t>
+      </w:r>
+      <w:r>
+        <w:t xml:space="preserve">ela congela por três segundos quando você abre a calça</w:t>
+      </w:r>
+      <w:r>
+        <w:t xml:space="preserve">”</w:t>
+      </w:r>
+      <w:r>
+        <w:t xml:space="preserve">); 30 dias reversão na ressonância. Prova: o selo postal volta como marco (15A: dia 1 inteiro, dia 3 rasgado); fita métrica aos 21 dias; RM do Mike aos 30 (60% → 28%). Imagem: os dois anéis de selo na mesa. Loop:</w:t>
       </w:r>
       <w:r>
         <w:t xml:space="preserve"> </w:t>

</xml_diff>